<commit_message>
fix(openvino): complete WB-04 v1.8 release contract
</commit_message>
<xml_diff>
--- a/docs/testing/workbooks/generated/04_Official_OpenVINO_Controlled_Retest_Workbook_v1.docx
+++ b/docs/testing/workbooks/generated/04_Official_OpenVINO_Controlled_Retest_Workbook_v1.docx
@@ -1303,7 +1303,7 @@
               <w:rPr>
                 <w:sz w:val="14"/>
               </w:rPr>
-              <w:t>testing/openvino-turboquant-recovery; v2 reconciliation input SHA-256 b4c892709128aeaa4bb29c5e9145eeb4dad60a0c30e28769cd616e4fd16da861; Pending PR; Pending merge</w:t>
+              <w:t>testing/openvino-turboquant-recovery; v2 reconciliation input SHA-256 96f7355a9446092ddad6d68c75d73bbd956bd24cd3213f9e12db470a87410c65; Pending PR; Pending merge</w:t>
             </w:r>
           </w:p>
         </w:tc>
@@ -1893,7 +1893,7 @@
               <w:rPr>
                 <w:sz w:val="14"/>
               </w:rPr>
-              <w:t>Focused discovery found 46 tests; two focused runs passed 46/46; production CPU plugin markers were present.</w:t>
+              <w:t>Focused discovery found 46 tests; run 1 passed 46/46 and run 2 passed 46/46. The production CPU plugin and CPU functional binary were verified, `query_state()` passed, and the invalid-destination fail-closed check passed.</w:t>
             </w:r>
           </w:p>
         </w:tc>
@@ -1911,63 +1911,7 @@
               <w:rPr>
                 <w:sz w:val="14"/>
               </w:rPr>
-              <w:t>`experiments/raw-results/openvino-turboquant/2026-07-29/guards/task03-attempt-006/t3a6-list2.json`, `t3a6-run1.json`, `t3a6-run2.json`, and `t3a6-plugin.json`.</w:t>
-            </w:r>
-          </w:p>
-        </w:tc>
-      </w:tr>
-      <w:tr>
-        <w:trPr>
-          <w:cantSplit/>
-        </w:trPr>
-        <w:tc>
-          <w:tcPr>
-            <w:tcW w:type="dxa" w:w="4848"/>
-            <w:vAlign w:val="center"/>
-          </w:tcPr>
-          <w:p>
-            <w:pPr>
-              <w:spacing w:after="0"/>
-            </w:pPr>
-            <w:r>
-              <w:rPr>
-                <w:sz w:val="14"/>
-              </w:rPr>
-              <w:t>OV-B11, OV-TQS-05, OV-TQS-06, OV-TQS-07, OV-TQS-08, OV-TQS-09, OV-TQS-10, OV-TQS-11, OV-TQS-12</w:t>
-            </w:r>
-          </w:p>
-        </w:tc>
-        <w:tc>
-          <w:tcPr>
-            <w:tcW w:type="dxa" w:w="4848"/>
-            <w:vAlign w:val="center"/>
-          </w:tcPr>
-          <w:p>
-            <w:pPr>
-              <w:spacing w:after="0"/>
-            </w:pPr>
-            <w:r>
-              <w:rPr>
-                <w:sz w:val="14"/>
-              </w:rPr>
-              <w:t>Property-boundary controller gates passed by rejecting the declared unsupported combinations before generation.</w:t>
-            </w:r>
-          </w:p>
-        </w:tc>
-        <w:tc>
-          <w:tcPr>
-            <w:tcW w:type="dxa" w:w="4848"/>
-            <w:vAlign w:val="center"/>
-          </w:tcPr>
-          <w:p>
-            <w:pPr>
-              <w:spacing w:after="0"/>
-            </w:pPr>
-            <w:r>
-              <w:rPr>
-                <w:sz w:val="14"/>
-              </w:rPr>
-              <w:t>`experiments/raw-results/openvino-turboquant/2026-07-30/expected-rejections/property-expected-rejections-current.json`; SHA-256 `ccb6460aac37e6444054d55cf571ecdd39313d45ae5a72270d3a7a972b7314a6`.</w:t>
+              <w:t>`experiments/raw-results/openvino-turboquant/2026-07-29/guards/task03-attempt-006/t3a6-list2.json`, `t3a6-run1.json`, `t3a6-run2.json`, `t3a6-plugin.json`, `t3a6-funcbuild.json`, and `t3-bad.json`.</w:t>
             </w:r>
           </w:p>
         </w:tc>
@@ -2107,7 +2051,7 @@
               <w:rPr>
                 <w:sz w:val="14"/>
               </w:rPr>
-              <w:t>Granite 3B U8 short CPU STANDARD generation produced valid output with `fallback=false` and cleanup 0.</w:t>
+              <w:t>Granite 3B U8 short CPU STANDARD generation produced valid output with 7 input tokens, 4 generated tokens, `fallback=false`, cleanup 0, and concrete K/V state f32/f32.</w:t>
             </w:r>
           </w:p>
         </w:tc>
@@ -2124,7 +2068,7 @@
               <w:rPr>
                 <w:sz w:val="14"/>
               </w:rPr>
-              <w:t>Diagnostic only; concrete K/V state was f32/f32, so this is not scalar-cache proof, a formal benchmark, or a quality result.</w:t>
+              <w:t>Diagnostic only; this weight-artifact success is not a formal benchmark, not scalar-cache proof, and not a quality result.</w:t>
             </w:r>
           </w:p>
         </w:tc>
@@ -2182,7 +2126,7 @@
               <w:rPr>
                 <w:sz w:val="14"/>
               </w:rPr>
-              <w:t>Granite 3B U4 short CPU STANDARD generation produced valid output with `fallback=false` and cleanup 0.</w:t>
+              <w:t>Granite 3B U4 short CPU STANDARD generation produced valid output with 7 input tokens, 4 generated tokens, `fallback=false`, cleanup 0, and concrete K/V state f32/f32.</w:t>
             </w:r>
           </w:p>
         </w:tc>
@@ -2200,7 +2144,7 @@
               <w:rPr>
                 <w:sz w:val="14"/>
               </w:rPr>
-              <w:t>Diagnostic only; concrete K/V state was f32/f32, so this is not scalar-cache proof, a formal benchmark, or a quality result.</w:t>
+              <w:t>Diagnostic only; this weight-artifact success is not a formal benchmark, not scalar-cache proof, and not a quality result.</w:t>
             </w:r>
           </w:p>
         </w:tc>
@@ -2323,7 +2267,7 @@
               <w:rPr>
                 <w:sz w:val="14"/>
               </w:rPr>
-              <w:t>Scalar semantic controls</w:t>
+              <w:t>Scalar-state controls</w:t>
             </w:r>
           </w:p>
         </w:tc>
@@ -2340,7 +2284,7 @@
               <w:rPr>
                 <w:sz w:val="14"/>
               </w:rPr>
-              <w:t>OV-04, OV-05, OV-TQ-01, OV-TQ-02</w:t>
+              <w:t>OV-04/4096, OV-05/4096, OV-TQ-01/4096, OV-TQ-02/4096</w:t>
             </w:r>
           </w:p>
         </w:tc>
@@ -2357,7 +2301,7 @@
               <w:rPr>
                 <w:sz w:val="14"/>
               </w:rPr>
-              <w:t>Passed expected rejection after bounded STANDARD activation showed concrete f32/f32 K/V state rather than the requested scalar precision.</w:t>
+              <w:t>Passed expected rejection after bounded STANDARD activation showed concrete f32/f32 K/V state rather than the requested scalar precision; these are successful boundary checks, not benchmark or quality results.</w:t>
             </w:r>
           </w:p>
         </w:tc>
@@ -2380,7 +2324,7 @@
               <w:rPr>
                 <w:sz w:val="14"/>
               </w:rPr>
-              <w:t>GPU TurboQuant control</w:t>
+              <w:t>Property-boundary controls</w:t>
             </w:r>
           </w:p>
         </w:tc>
@@ -2398,7 +2342,7 @@
               <w:rPr>
                 <w:sz w:val="14"/>
               </w:rPr>
-              <w:t>OV-TQ-18</w:t>
+              <w:t>OV-TQS-05, OV-TQS-06, OV-TQS-07, OV-TQS-08, OV-TQS-09, OV-TQS-10, OV-TQS-11, OV-TQS-12</w:t>
             </w:r>
           </w:p>
         </w:tc>
@@ -2416,7 +2360,7 @@
               <w:rPr>
                 <w:sz w:val="14"/>
               </w:rPr>
-              <w:t>Passed expected rejection before generation because the governed TurboQuant route is CPU-only.</w:t>
+              <w:t>Passed the setup/property boundary by rejecting unsupported scalar/TurboQuant combinations before generation; these are successful boundary checks, not benchmark or quality results.</w:t>
             </w:r>
           </w:p>
         </w:tc>
@@ -2438,7 +2382,7 @@
               <w:rPr>
                 <w:sz w:val="14"/>
               </w:rPr>
-              <w:t>QJL and Polar controls</w:t>
+              <w:t>Device/codec controls</w:t>
             </w:r>
           </w:p>
         </w:tc>
@@ -2455,7 +2399,7 @@
               <w:rPr>
                 <w:sz w:val="14"/>
               </w:rPr>
-              <w:t>OV-TQ-19, OV-TQ-20</w:t>
+              <w:t>OV-TQ-18/1024, OV-TQ-19/256, OV-TQ-20/256, OV-B11</w:t>
             </w:r>
           </w:p>
         </w:tc>
@@ -2472,7 +2416,7 @@
               <w:rPr>
                 <w:sz w:val="14"/>
               </w:rPr>
-              <w:t>Passed expected rejection before generation for the declared unsupported property combinations.</w:t>
+              <w:t>Passed the device/codec boundary by rejecting GPU TurboQuant, QJL, Polar, and the invalid destination before generation; these are successful boundary checks, not benchmark or quality results.</w:t>
             </w:r>
           </w:p>
         </w:tc>
@@ -2494,6 +2438,14 @@
       </w:pPr>
       <w:r>
         <w:t>5. Accepted formal runtime measurements</w:t>
+      </w:r>
+    </w:p>
+    <w:p>
+      <w:pPr>
+        <w:spacing w:after="60"/>
+      </w:pPr>
+      <w:r>
+        <w:t>All three accepted rows executed on CPU with `fallback=false`; cleanup was verified with zero residual processes.</w:t>
       </w:r>
     </w:p>
     <w:p>
@@ -4523,7 +4475,7 @@
               <w:rPr>
                 <w:sz w:val="14"/>
               </w:rPr>
-              <w:t>Runtime presentation</w:t>
+              <w:t>Proven runtime scope</w:t>
             </w:r>
           </w:p>
         </w:tc>
@@ -4540,7 +4492,7 @@
               <w:rPr>
                 <w:sz w:val="14"/>
               </w:rPr>
-              <w:t>Only E1-E3 are accepted formal runtime measurements.</w:t>
+              <w:t>Exactly OV-TQ-13/512, OV-TQ-14/512, and OV-TQ-14/2048 are accepted formal runtime measurements.</w:t>
             </w:r>
           </w:p>
         </w:tc>
@@ -4563,6 +4515,206 @@
               <w:rPr>
                 <w:sz w:val="14"/>
               </w:rPr>
+              <w:t>Best observed runtime facts</w:t>
+            </w:r>
+          </w:p>
+        </w:tc>
+        <w:tc>
+          <w:tcPr>
+            <w:tcW w:type="dxa" w:w="7272"/>
+            <w:vAlign w:val="center"/>
+            <w:shd w:fill="EAF2F8"/>
+          </w:tcPr>
+          <w:p>
+            <w:pPr>
+              <w:spacing w:after="0"/>
+            </w:pPr>
+            <w:r>
+              <w:rPr>
+                <w:sz w:val="14"/>
+              </w:rPr>
+              <w:t>The observed runtime facts are: lowest median load 8079.655 ms (OV-TQ-14/512); lowest median TTFT 18234.156 ms (OV-TQ-14/512); highest median decode throughput 1.5 tok/s (OV-TQ-14/512). These are runtime observations; no winner is declared from quality evidence.</w:t>
+            </w:r>
+          </w:p>
+        </w:tc>
+      </w:tr>
+      <w:tr>
+        <w:trPr>
+          <w:cantSplit/>
+        </w:trPr>
+        <w:tc>
+          <w:tcPr>
+            <w:tcW w:type="dxa" w:w="7272"/>
+            <w:vAlign w:val="center"/>
+          </w:tcPr>
+          <w:p>
+            <w:pPr>
+              <w:spacing w:after="0"/>
+            </w:pPr>
+            <w:r>
+              <w:rPr>
+                <w:sz w:val="14"/>
+              </w:rPr>
+              <w:t>Execution boundary</w:t>
+            </w:r>
+          </w:p>
+        </w:tc>
+        <w:tc>
+          <w:tcPr>
+            <w:tcW w:type="dxa" w:w="7272"/>
+            <w:vAlign w:val="center"/>
+          </w:tcPr>
+          <w:p>
+            <w:pPr>
+              <w:spacing w:after="0"/>
+            </w:pPr>
+            <w:r>
+              <w:rPr>
+                <w:sz w:val="14"/>
+              </w:rPr>
+              <w:t>The accepted formal scope is CPU-only with fallback=false and cleanup verified for every row.</w:t>
+            </w:r>
+          </w:p>
+        </w:tc>
+      </w:tr>
+      <w:tr>
+        <w:trPr>
+          <w:cantSplit/>
+        </w:trPr>
+        <w:tc>
+          <w:tcPr>
+            <w:tcW w:type="dxa" w:w="7272"/>
+            <w:vAlign w:val="center"/>
+            <w:shd w:fill="EAF2F8"/>
+          </w:tcPr>
+          <w:p>
+            <w:pPr>
+              <w:spacing w:after="0"/>
+            </w:pPr>
+            <w:r>
+              <w:rPr>
+                <w:sz w:val="14"/>
+              </w:rPr>
+              <w:t>GPU boundary</w:t>
+            </w:r>
+          </w:p>
+        </w:tc>
+        <w:tc>
+          <w:tcPr>
+            <w:tcW w:type="dxa" w:w="7272"/>
+            <w:vAlign w:val="center"/>
+            <w:shd w:fill="EAF2F8"/>
+          </w:tcPr>
+          <w:p>
+            <w:pPr>
+              <w:spacing w:after="0"/>
+            </w:pPr>
+            <w:r>
+              <w:rPr>
+                <w:sz w:val="14"/>
+              </w:rPr>
+              <w:t>No accepted GPU formal measurement exists.</w:t>
+            </w:r>
+          </w:p>
+        </w:tc>
+      </w:tr>
+      <w:tr>
+        <w:trPr>
+          <w:cantSplit/>
+        </w:trPr>
+        <w:tc>
+          <w:tcPr>
+            <w:tcW w:type="dxa" w:w="7272"/>
+            <w:vAlign w:val="center"/>
+          </w:tcPr>
+          <w:p>
+            <w:pPr>
+              <w:spacing w:after="0"/>
+            </w:pPr>
+            <w:r>
+              <w:rPr>
+                <w:sz w:val="14"/>
+              </w:rPr>
+              <w:t>Non-TurboQuant boundary</w:t>
+            </w:r>
+          </w:p>
+        </w:tc>
+        <w:tc>
+          <w:tcPr>
+            <w:tcW w:type="dxa" w:w="7272"/>
+            <w:vAlign w:val="center"/>
+          </w:tcPr>
+          <w:p>
+            <w:pPr>
+              <w:spacing w:after="0"/>
+            </w:pPr>
+            <w:r>
+              <w:rPr>
+                <w:sz w:val="14"/>
+              </w:rPr>
+              <w:t>No non-TurboQuant formal benchmark exists; the U4/U8 STANDARD results remain diagnostics only.</w:t>
+            </w:r>
+          </w:p>
+        </w:tc>
+      </w:tr>
+      <w:tr>
+        <w:trPr>
+          <w:cantSplit/>
+        </w:trPr>
+        <w:tc>
+          <w:tcPr>
+            <w:tcW w:type="dxa" w:w="7272"/>
+            <w:vAlign w:val="center"/>
+            <w:shd w:fill="EAF2F8"/>
+          </w:tcPr>
+          <w:p>
+            <w:pPr>
+              <w:spacing w:after="0"/>
+            </w:pPr>
+            <w:r>
+              <w:rPr>
+                <w:sz w:val="14"/>
+              </w:rPr>
+              <w:t>Continuation</w:t>
+            </w:r>
+          </w:p>
+        </w:tc>
+        <w:tc>
+          <w:tcPr>
+            <w:tcW w:type="dxa" w:w="7272"/>
+            <w:vAlign w:val="center"/>
+            <w:shd w:fill="EAF2F8"/>
+          </w:tcPr>
+          <w:p>
+            <w:pPr>
+              <w:spacing w:after="0"/>
+            </w:pPr>
+            <w:r>
+              <w:rPr>
+                <w:sz w:val="14"/>
+              </w:rPr>
+              <w:t>Continue the blocked larger-context and larger-model campaigns on a higher-memory host.</w:t>
+            </w:r>
+          </w:p>
+        </w:tc>
+      </w:tr>
+      <w:tr>
+        <w:trPr>
+          <w:cantSplit/>
+        </w:trPr>
+        <w:tc>
+          <w:tcPr>
+            <w:tcW w:type="dxa" w:w="7272"/>
+            <w:vAlign w:val="center"/>
+          </w:tcPr>
+          <w:p>
+            <w:pPr>
+              <w:spacing w:after="0"/>
+            </w:pPr>
+            <w:r>
+              <w:rPr>
+                <w:sz w:val="14"/>
+              </w:rPr>
               <w:t>Quality boundary</w:t>
             </w:r>
           </w:p>
@@ -4571,7 +4723,6 @@
           <w:tcPr>
             <w:tcW w:type="dxa" w:w="7272"/>
             <w:vAlign w:val="center"/>
-            <w:shd w:fill="EAF2F8"/>
           </w:tcPr>
           <w:p>
             <w:pPr>
@@ -4809,7 +4960,7 @@
               <w:rPr>
                 <w:sz w:val="14"/>
               </w:rPr>
-              <w:t>experiments/raw-results/openvino-turboquant/2026-07-30/reconciliation-input.json#sha256=b4c892709128aeaa4bb29c5e9145eeb4dad60a0c30e28769cd616e4fd16da861</w:t>
+              <w:t>experiments/raw-results/openvino-turboquant/2026-07-30/reconciliation-input.json#sha256=96f7355a9446092ddad6d68c75d73bbd956bd24cd3213f9e12db470a87410c65</w:t>
             </w:r>
           </w:p>
         </w:tc>

</xml_diff>